<commit_message>
Align PRD with live MVP implementation
</commit_message>
<xml_diff>
--- a/documentation/NetraJyoti_MVP_PRD_v5_Updated_User_Journey_Diagram.docx
+++ b/documentation/NetraJyoti_MVP_PRD_v5_Updated_User_Journey_Diagram.docx
@@ -21,12 +21,7 @@
         <w:spacing w:after="280"/>
       </w:pPr>
       <w:r>
-        <w:rPr>
-          <w:rFonts w:ascii="Calibri" w:hAnsi="Calibri"/>
-          <w:color w:val="455A6E"/>
-          <w:sz w:val="28"/>
-        </w:rPr>
-        <w:t>NetraJyoti MVP — Bengali voice-first eye-health guidance and referral support</w:t>
+        <w:t>NetraJyoti MVP - Bengali-first, non-diagnostic eye-care navigation and referral support</w:t>
       </w:r>
     </w:p>
     <w:tbl>
@@ -133,11 +128,6 @@
               <w:spacing w:after="0"/>
             </w:pPr>
             <w:r>
-              <w:rPr>
-                <w:rFonts w:ascii="Calibri" w:hAnsi="Calibri"/>
-                <w:color w:val="0B2545"/>
-                <w:sz w:val="18"/>
-              </w:rPr>
               <w:t>NetraJyoti AI</w:t>
             </w:r>
           </w:p>
@@ -174,12 +164,7 @@
               <w:spacing w:after="0"/>
             </w:pPr>
             <w:r>
-              <w:rPr>
-                <w:rFonts w:ascii="Calibri" w:hAnsi="Calibri"/>
-                <w:color w:val="0B2545"/>
-                <w:sz w:val="18"/>
-              </w:rPr>
-              <w:t>Capstone MVP requirements baseline + controlled GenAI pilot</w:t>
+              <w:t>Capstone MVP requirements baseline, aligned to current live implementation</w:t>
             </w:r>
           </w:p>
         </w:tc>
@@ -297,9 +282,7 @@
               <w:spacing w:after="0"/>
             </w:pPr>
             <w:r>
-              <w:t>5.1</w:t>
-              <w:br/>
-              <w:t>1 August 2026</w:t>
+              <w:t>5.2 / 3 September 2026</w:t>
             </w:r>
           </w:p>
         </w:tc>
@@ -637,21 +620,7 @@
               <w:spacing w:after="0"/>
             </w:pPr>
             <w:r>
-              <w:rPr>
-                <w:rFonts w:ascii="Calibri" w:hAnsi="Calibri"/>
-                <w:b/>
-                <w:color w:val="9B1C1C"/>
-                <w:sz w:val="22"/>
-              </w:rPr>
-              <w:t xml:space="preserve">Decision summary: </w:t>
-            </w:r>
-            <w:r>
-              <w:rPr>
-                <w:rFonts w:ascii="Calibri" w:hAnsi="Calibri"/>
-                <w:color w:val="0B2545"/>
-                <w:sz w:val="22"/>
-              </w:rPr>
-              <w:t>Core MVP routing uses fixed, clinician-reviewable Bengali guidance and rules-based red-flag escalation. A controlled pilot may use GenAI only after the care outcome is fixed: to simplify a server-approved Bengali message or create a short caregiver summary from approved result content. It must not receive user inputs, change urgency, diagnose disease, prescribe treatment or invent service details.</w:t>
+              <w:t>Decision summary: The live MVP selects URGENT, ROUTINE or HUMAN SUPPORT through Java deterministic routing after PostgreSQL criterion retrieval. Optional local Ollama runs only after the route is fixed, using PostgreSQL route-guidance records to create a short Bengali explanation. Ollama cannot select or change the route. The current database records are demo-simulated and not clinically approved; Java fallback guidance remains available for every failure.</w:t>
             </w:r>
           </w:p>
         </w:tc>
@@ -2172,11 +2141,6 @@
               <w:spacing w:after="0"/>
             </w:pPr>
             <w:r>
-              <w:rPr>
-                <w:rFonts w:ascii="Calibri" w:hAnsi="Calibri"/>
-                <w:color w:val="0B2545"/>
-                <w:sz w:val="18"/>
-              </w:rPr>
               <w:t>Accredited Social Health Activist/community-health worker who may assist a user but does not diagnose through NetraJyoti.</w:t>
             </w:r>
           </w:p>
@@ -2213,12 +2177,7 @@
               <w:spacing w:after="0"/>
             </w:pPr>
             <w:r>
-              <w:rPr>
-                <w:rFonts w:ascii="Calibri" w:hAnsi="Calibri"/>
-                <w:color w:val="0B2545"/>
-                <w:sz w:val="18"/>
-              </w:rPr>
-              <w:t>Prototype information that must not be relied on for travel or treatment decisions.</w:t>
+              <w:t>Prototype information that is displayed only for capstone demonstration. It is not clinically approved and must not be relied on for travel or treatment decisions.</w:t>
             </w:r>
           </w:p>
         </w:tc>
@@ -2459,12 +2418,7 @@
         <w:spacing w:after="100" w:line="264" w:lineRule="auto"/>
       </w:pPr>
       <w:r>
-        <w:rPr>
-          <w:rFonts w:ascii="Calibri" w:hAnsi="Calibri"/>
-          <w:color w:val="0B2545"/>
-          <w:sz w:val="22"/>
-        </w:rPr>
-        <w:t>Using GenAI for triage, diagnosis, prescriptions, free-form clinical chat or altering approved health guidance.</w:t>
+        <w:t>Using GenAI for triage, diagnosis, prescriptions, free-form clinical chat or altering the Java-selected safe route. The optional local Ollama explanation is post-route only and uses retrieved PostgreSQL guidance.</w:t>
       </w:r>
     </w:p>
     <w:p>
@@ -3523,12 +3477,7 @@
               <w:spacing w:after="0"/>
             </w:pPr>
             <w:r>
-              <w:rPr>
-                <w:rFonts w:ascii="Calibri" w:hAnsi="Calibri"/>
-                <w:color w:val="0B2545"/>
-                <w:sz w:val="18"/>
-              </w:rPr>
-              <w:t>Short, voice-first Bengali interaction with visible text fallback and caregiver support.</w:t>
+              <w:t>Rules-based urgency and a Java-controlled route. Optional local Ollama explains only the already selected route from PostgreSQL guidance and is validated by Java; it cannot diagnose, prescribe, alter urgency or invent service details.</w:t>
             </w:r>
           </w:p>
         </w:tc>
@@ -3752,12 +3701,7 @@
               <w:spacing w:after="0"/>
             </w:pPr>
             <w:r>
-              <w:rPr>
-                <w:rFonts w:ascii="Calibri" w:hAnsi="Calibri"/>
-                <w:color w:val="0B2545"/>
-                <w:sz w:val="18"/>
-              </w:rPr>
-              <w:t>Bengali voice input; text fallback; consent; rules-based red-flag routing; fixed Bengali guidance; non-diagnosis disclaimer; demo-only service direction; caregiver summary.</w:t>
+              <w:t>Bengali voice input with text fallback; acknowledgement; Java deterministic routing using PostgreSQL criteria; fixed route action cards; optional local Ollama RAG explanation; demo-only service direction; browser share/copy family message.</w:t>
             </w:r>
           </w:p>
         </w:tc>
@@ -3793,12 +3737,7 @@
               <w:spacing w:after="0"/>
             </w:pPr>
             <w:r>
-              <w:rPr>
-                <w:rFonts w:ascii="Calibri" w:hAnsi="Calibri"/>
-                <w:color w:val="0B2545"/>
-                <w:sz w:val="18"/>
-              </w:rPr>
-              <w:t>AI-assisted plain-Bengali explanation and short caregiver summary from a server-approved result message, behind a feature flag, with clinical, privacy and output-evaluation gates.</w:t>
+              <w:t>Clinical approval of the PostgreSQL guidance corpus; AI-assisted labelling; feedback capture; partner-verified directory management; ASHA-assisted workflow; public-pilot security and governance controls.</w:t>
             </w:r>
           </w:p>
         </w:tc>
@@ -3967,12 +3906,6 @@
               <w:spacing w:after="0"/>
             </w:pPr>
             <w:r>
-              <w:rPr>
-                <w:rFonts w:ascii="Calibri" w:hAnsi="Calibri"/>
-                <w:b/>
-                <w:color w:val="1F4D78"/>
-                <w:sz w:val="19"/>
-              </w:rPr>
               <w:t>In scope</w:t>
             </w:r>
           </w:p>
@@ -3994,12 +3927,6 @@
               <w:spacing w:after="0"/>
             </w:pPr>
             <w:r>
-              <w:rPr>
-                <w:rFonts w:ascii="Calibri" w:hAnsi="Calibri"/>
-                <w:b/>
-                <w:color w:val="1F4D78"/>
-                <w:sz w:val="19"/>
-              </w:rPr>
               <w:t>Deferred / out of scope</w:t>
             </w:r>
           </w:p>
@@ -4018,12 +3945,7 @@
               <w:spacing w:after="0"/>
             </w:pPr>
             <w:r>
-              <w:rPr>
-                <w:rFonts w:ascii="Calibri" w:hAnsi="Calibri"/>
-                <w:color w:val="0B2545"/>
-                <w:sz w:val="18"/>
-              </w:rPr>
-              <w:t>Bengali voice input with text fallback; Bengali text and spoken output.</w:t>
+              <w:t>Bengali voice input with text fallback; fixed-category routing; Java fixed route action cards; optional local Ollama RAG explanation from PostgreSQL route guidance; static demo service direction; browser-native share/copy family message; safety/privacy acknowledgement.</w:t>
             </w:r>
           </w:p>
         </w:tc>
@@ -4036,12 +3958,7 @@
               <w:spacing w:after="0"/>
             </w:pPr>
             <w:r>
-              <w:rPr>
-                <w:rFonts w:ascii="Calibri" w:hAnsi="Calibri"/>
-                <w:color w:val="0B2545"/>
-                <w:sz w:val="18"/>
-              </w:rPr>
-              <w:t>Image-based or disease diagnosis.</w:t>
+              <w:t>Text-to-speech result audio; clinical approval of content; persistent feedback; verified public directory; automated booking, WhatsApp integration, payment or EHR connectivity.</w:t>
             </w:r>
           </w:p>
         </w:tc>
@@ -4059,12 +3976,7 @@
               <w:spacing w:after="0"/>
             </w:pPr>
             <w:r>
-              <w:rPr>
-                <w:rFonts w:ascii="Calibri" w:hAnsi="Calibri"/>
-                <w:color w:val="0B2545"/>
-                <w:sz w:val="18"/>
-              </w:rPr>
-              <w:t>Rules-based urgency checks for sudden blurred vision, severe pain, injury and chemical exposure.</w:t>
+              <w:t>Rules-based urgency checks for sudden vision change, severe pain, injury and chemical exposure. Java/PostgreSQL routing determines the result before any Ollama request.</w:t>
             </w:r>
           </w:p>
         </w:tc>
@@ -4077,11 +3989,6 @@
               <w:spacing w:after="0"/>
             </w:pPr>
             <w:r>
-              <w:rPr>
-                <w:rFonts w:ascii="Calibri" w:hAnsi="Calibri"/>
-                <w:color w:val="0B2545"/>
-                <w:sz w:val="18"/>
-              </w:rPr>
               <w:t>Prescriptions, treatment plans or dosage advice.</w:t>
             </w:r>
           </w:p>
@@ -4100,12 +4007,7 @@
               <w:spacing w:after="0"/>
             </w:pPr>
             <w:r>
-              <w:rPr>
-                <w:rFonts w:ascii="Calibri" w:hAnsi="Calibri"/>
-                <w:color w:val="0B2545"/>
-                <w:sz w:val="18"/>
-              </w:rPr>
-              <w:t>Fixed Bengali guidance for urgent, routine and human-escalation paths; controlled-pilot simplification of an approved result message only.</w:t>
+              <w:t>Fixed Bengali Java fallback guidance for urgent, routine and human-support routes; optional Java-validated local Ollama explanation of the already selected route.</w:t>
             </w:r>
           </w:p>
         </w:tc>
@@ -4118,11 +4020,6 @@
               <w:spacing w:after="0"/>
             </w:pPr>
             <w:r>
-              <w:rPr>
-                <w:rFonts w:ascii="Calibri" w:hAnsi="Calibri"/>
-                <w:color w:val="0B2545"/>
-                <w:sz w:val="18"/>
-              </w:rPr>
               <w:t>Generative AI health answers, free-form clinical chat, diagnosis, prescriptions or AI-driven triage.</w:t>
             </w:r>
           </w:p>
@@ -4141,12 +4038,7 @@
               <w:spacing w:after="0"/>
             </w:pPr>
             <w:r>
-              <w:rPr>
-                <w:rFonts w:ascii="Calibri" w:hAnsi="Calibri"/>
-                <w:color w:val="0B2545"/>
-                <w:sz w:val="18"/>
-              </w:rPr>
-              <w:t>Demo-only service directory; fixed caregiver summary; controlled-pilot AI-assisted caregiver summary from approved result content; feedback capture; safety and privacy consent.</w:t>
+              <w:t>Static demo service direction and browser share/copy family message. The UI does not persist feedback and does not provide result-page audio.</w:t>
             </w:r>
           </w:p>
         </w:tc>
@@ -4159,11 +4051,6 @@
               <w:spacing w:after="0"/>
             </w:pPr>
             <w:r>
-              <w:rPr>
-                <w:rFonts w:ascii="Calibri" w:hAnsi="Calibri"/>
-                <w:color w:val="0B2545"/>
-                <w:sz w:val="18"/>
-              </w:rPr>
               <w:t>Verified public directory, automated booking, WhatsApp integration, payment or EHR connectivity.</w:t>
             </w:r>
           </w:p>
@@ -4634,11 +4521,6 @@
               <w:spacing w:after="0"/>
             </w:pPr>
             <w:r>
-              <w:rPr>
-                <w:rFonts w:ascii="Calibri" w:hAnsi="Calibri"/>
-                <w:color w:val="0B2545"/>
-                <w:sz w:val="18"/>
-              </w:rPr>
               <w:t>Not in the public MVP UI. A future authenticated partner workflow must record source, reviewer, last-reviewed date and expiry; unverified entries must never be marked verified.</w:t>
             </w:r>
           </w:p>
@@ -4693,12 +4575,7 @@
               <w:spacing w:after="0"/>
             </w:pPr>
             <w:r>
-              <w:rPr>
-                <w:rFonts w:ascii="Calibri" w:hAnsi="Calibri"/>
-                <w:color w:val="0B2545"/>
-                <w:sz w:val="18"/>
-              </w:rPr>
-              <w:t>Controlled pilot only. Rules select the outcome and approved message before any model call. The model receives only approved copy, cannot change urgency or provide clinical advice, and its short output is labelled AI-assisted. On timeout, invalid output or unavailable configuration, show the original approved copy.</w:t>
+              <w:t>Current live implementation: Java selects the route before the Ollama call; the backend sends only retrieved Bengali route-guidance content to local Ollama, not free text, voice, location or personal details. Java validates output and falls back to fixed Bengali text. Gap before a controlled pilot: use clinically approved guidance records and clearly label accepted output as AI-assisted.</w:t>
             </w:r>
           </w:p>
         </w:tc>
@@ -4752,12 +4629,7 @@
               <w:spacing w:after="0"/>
             </w:pPr>
             <w:r>
-              <w:rPr>
-                <w:rFonts w:ascii="Calibri" w:hAnsi="Calibri"/>
-                <w:color w:val="0B2545"/>
-                <w:sz w:val="18"/>
-              </w:rPr>
-              <w:t>Controlled pilot only. The backend sends only the already-approved result content to create a brief caregiver summary. It cannot change urgency, care type or clinical facts; it is labelled AI-assisted. Do not send voice transcripts, symptom details, optional questions, district/location or identifiers. On timeout, unsafe output or unavailable configuration, show the fixed approved caregiver summary.</w:t>
+              <w:t>Current live implementation: a user can review, copy or share a family message containing the selected route guidance and symptoms. It is not a separate AI caregiver-summary capability derived solely from approved final-result content. That capability remains controlled-pilot work.</w:t>
             </w:r>
           </w:p>
         </w:tc>
@@ -4798,7 +4670,7 @@
               <w:spacing w:after="0"/>
             </w:pPr>
             <w:r>
-              <w:t>Jira NET-8. Before continuing, acknowledge the versioned safety/privacy notice. Optional collection for research recording, referral sharing or analytics requires separate consent; the no-storage core guidance path remains available.</w:t>
+              <w:t>Current live implementation: acknowledgement is required before assessment. Optional patient details remain in browser state and are included in a shared message only after a separate checkbox acknowledgement. Research, analytics and recording consent are deferred.</w:t>
             </w:r>
           </w:p>
         </w:tc>
@@ -4839,7 +4711,7 @@
               <w:spacing w:after="0"/>
             </w:pPr>
             <w:r>
-              <w:t>Jira NET-9. Test all URGENT, ROUTINE and HUMAN ESCALATION rules; no-diagnosis wording; Bengali readability; mobile touch targets; voice, audio, network and directory fallbacks; and the agreed device/browser matrix.</w:t>
+              <w:t>Current live implementation: routing-policy unit tests and Bengali text fallback exist. End-to-end device, voice, slow-network, directory and usability testing remain release-gate work.</w:t>
             </w:r>
           </w:p>
         </w:tc>
@@ -4880,7 +4752,7 @@
               <w:spacing w:after="0"/>
             </w:pPr>
             <w:r>
-              <w:t>Jira NET-10. After analytics consent, record only the approved aggregate event schema. Exclude voice, symptoms, free text, identifiers, precise location and raw GenAI output; support opt-out and documented retention/access controls.</w:t>
+              <w:t>Deferred. No feedback or analytics UI, API or persistent store is present in the current live MVP.</w:t>
             </w:r>
           </w:p>
         </w:tc>
@@ -5173,12 +5045,7 @@
               <w:spacing w:after="0"/>
             </w:pPr>
             <w:r>
-              <w:rPr>
-                <w:rFonts w:ascii="Calibri" w:hAnsi="Calibri"/>
-                <w:color w:val="0B2545"/>
-                <w:sz w:val="18"/>
-              </w:rPr>
-              <w:t>Return URGENT when injury/chemical exposure, severe pain, or sudden onset of blurred vision is recorded. Return HUMAN ESCALATION for 'Other'. Otherwise return ROUTINE.</w:t>
+              <w:t>Return URGENT for configured injury/chemical exposure, severe pain or sudden vision change. Return HUMAN SUPPORT for Other/unclear concerns, explicit request for a person, escalation criteria or no eligible demo criterion. Otherwise return ROUTINE. Java applies fixed precedence: URGENT, HUMAN SUPPORT, ROUTINE.</w:t>
             </w:r>
           </w:p>
         </w:tc>
@@ -5232,12 +5099,7 @@
               <w:spacing w:after="0"/>
             </w:pPr>
             <w:r>
-              <w:rPr>
-                <w:rFonts w:ascii="Calibri" w:hAnsi="Calibri"/>
-                <w:color w:val="0B2545"/>
-                <w:sz w:val="18"/>
-              </w:rPr>
-              <w:t>Use fixed Bengali copy maintained in the rules service. Read it aloud where browser speech synthesis is available; always keep text visible.</w:t>
+              <w:t>The live MVP shows fixed Bengali result text and a Java-controlled action card. Browser speech recognition is offered as optional input with a typed fallback; result-page audio is not provided.</w:t>
             </w:r>
           </w:p>
         </w:tc>
@@ -5291,12 +5153,7 @@
               <w:spacing w:after="0"/>
             </w:pPr>
             <w:r>
-              <w:rPr>
-                <w:rFonts w:ascii="Calibri" w:hAnsi="Calibri"/>
-                <w:color w:val="0B2545"/>
-                <w:sz w:val="18"/>
-              </w:rPr>
-              <w:t>Recommend a type of care based on urgency. Show the MVP directory only as DEMO ONLY and tell the user to verify locally before travel.</w:t>
+              <w:t>Recommend a type of care based on the selected route. The live UI displays static demo service options and asks the user to verify locally before travel. The PostgreSQL service-location repository is not yet connected to the UI.</w:t>
             </w:r>
           </w:p>
         </w:tc>
@@ -5350,12 +5207,7 @@
               <w:spacing w:after="0"/>
             </w:pPr>
             <w:r>
-              <w:rPr>
-                <w:rFonts w:ascii="Calibri" w:hAnsi="Calibri"/>
-                <w:color w:val="0B2545"/>
-                <w:sz w:val="18"/>
-              </w:rPr>
-              <w:t>Allow a concise, shareable summary containing result title and guidance; use browser-native sharing or copy as fallback.</w:t>
+              <w:t>Allow a concise, shareable family message containing the selected route guidance and symptoms; use browser-native sharing or copy as fallback. Optional patient details remain on-device and are added only after a separate acknowledgement.</w:t>
             </w:r>
           </w:p>
         </w:tc>
@@ -5409,12 +5261,7 @@
               <w:spacing w:after="0"/>
             </w:pPr>
             <w:r>
-              <w:rPr>
-                <w:rFonts w:ascii="Calibri" w:hAnsi="Calibri"/>
-                <w:color w:val="0B2545"/>
-                <w:sz w:val="18"/>
-              </w:rPr>
-              <w:t>Capture a clarity/usefulness rating and optional comment in a future persistent store. The prototype may acknowledge receipt without retaining data.</w:t>
+              <w:t>Deferred. The live MVP does not capture a clarity/usefulness rating, optional comment, or feedback acknowledgement.</w:t>
             </w:r>
           </w:p>
         </w:tc>
@@ -5468,12 +5315,7 @@
               <w:spacing w:after="0"/>
             </w:pPr>
             <w:r>
-              <w:rPr>
-                <w:rFonts w:ascii="Calibri" w:hAnsi="Calibri"/>
-                <w:color w:val="0B2545"/>
-                <w:sz w:val="18"/>
-              </w:rPr>
-              <w:t>After the rules engine has selected an outcome, a server-side feature flag may send only the approved Bengali message to an approved GenAI provider for plain-language simplification. Do not send voice transcripts, symptom details, optional questions, district/location or identifiers. Validate output; label it AI-assisted; fall back to the original approved copy on error, timeout, unsafe output or missing configuration.</w:t>
+              <w:t>Live MVP: after Java selects the route, an explicit backend flag may send only PostgreSQL-retrieved Bengali route-guidance content to local Ollama. It cannot change the route; Java validates output and uses fixed Bengali fallback on error, unavailable retrieval or unsafe output. The current retrieved records are demo-simulated, not clinically approved. AI-assisted labelling and clinically approved content are required before a controlled pilot.</w:t>
             </w:r>
           </w:p>
         </w:tc>
@@ -5527,12 +5369,7 @@
               <w:spacing w:after="0"/>
             </w:pPr>
             <w:r>
-              <w:rPr>
-                <w:rFonts w:ascii="Calibri" w:hAnsi="Calibri"/>
-                <w:color w:val="0B2545"/>
-                <w:sz w:val="18"/>
-              </w:rPr>
-              <w:t>After the rules engine has selected the outcome, a server-side feature flag may create a concise caregiver summary only from the already-approved result content. Preserve the outcome, urgency, care type and original guidance; do not add facts, diagnoses, medicines or provider details. Label the accepted summary AI-assisted and fall back to the fixed approved caregiver summary on error, timeout, unsafe output or missing configuration. Do not send user-entered data to the provider.</w:t>
+              <w:t>Deferred controlled-pilot capability. The live MVP provides a browser share/copy family message, not a separate AI-generated caregiver summary from approved result content.</w:t>
             </w:r>
           </w:p>
         </w:tc>
@@ -5815,21 +5652,7 @@
               <w:spacing w:after="0"/>
             </w:pPr>
             <w:r>
-              <w:rPr>
-                <w:rFonts w:ascii="Calibri" w:hAnsi="Calibri"/>
-                <w:b/>
-                <w:color w:val="9B1C1C"/>
-                <w:sz w:val="22"/>
-              </w:rPr>
-              <w:t xml:space="preserve">Safety requirement: </w:t>
-            </w:r>
-            <w:r>
-              <w:rPr>
-                <w:rFonts w:ascii="Calibri" w:hAnsi="Calibri"/>
-                <w:color w:val="0B2545"/>
-                <w:sz w:val="22"/>
-              </w:rPr>
-              <w:t>Urgency is determined only by the reviewed rules engine. The public MVP has no GenAI clinical guidance. A controlled GenAI pilot may simplify a server-approved Bengali message only after the outcome is fixed; it must be independently evaluated and prevented from changing urgency, diagnosing, prescribing or adding facts.</w:t>
+              <w:t>Safety requirement: Java deterministic routing is the only component that selects the route. It retrieves eligible PostgreSQL criteria and applies fixed precedence: URGENT, then HUMAN SUPPORT, then ROUTINE. Optional local Ollama runs only after the route is fixed and cannot change urgency, diagnose, prescribe or add service details. Demo-simulated data are not clinically approved and are not production eligible.</w:t>
             </w:r>
           </w:p>
         </w:tc>
@@ -5846,12 +5669,7 @@
         <w:spacing w:after="100" w:line="264" w:lineRule="auto"/>
       </w:pPr>
       <w:r>
-        <w:rPr>
-          <w:rFonts w:ascii="Calibri" w:hAnsi="Calibri"/>
-          <w:color w:val="0B2545"/>
-          <w:sz w:val="22"/>
-        </w:rPr>
-        <w:t>Display 'Guidance, not diagnosis' and urgent-care instructions throughout the flow.</w:t>
+        <w:t>Display 'Safe information, not a diagnosis' and urgent-care instructions throughout the flow. The route-result action card is Java controlled.</w:t>
       </w:r>
     </w:p>
     <w:p>
@@ -5860,12 +5678,7 @@
         <w:spacing w:after="100" w:line="264" w:lineRule="auto"/>
       </w:pPr>
       <w:r>
-        <w:rPr>
-          <w:rFonts w:ascii="Calibri" w:hAnsi="Calibri"/>
-          <w:color w:val="0B2545"/>
-          <w:sz w:val="22"/>
-        </w:rPr>
-        <w:t>Collect the minimum data needed: concern, urgent flags, district and optional question. Do not request medical records, photographs, identity numbers or payment information.</w:t>
+        <w:t>The live routing API receives selected fixed concern codes, urgent-sign codes, optional structured history and an explicit request for human support. Free text, browser speech transcripts, location and patient details do not determine the route.</w:t>
       </w:r>
     </w:p>
     <w:p>
@@ -5874,12 +5687,7 @@
         <w:spacing w:after="100" w:line="264" w:lineRule="auto"/>
       </w:pPr>
       <w:r>
-        <w:rPr>
-          <w:rFonts w:ascii="Calibri" w:hAnsi="Calibri"/>
-          <w:color w:val="0B2545"/>
-          <w:sz w:val="22"/>
-        </w:rPr>
-        <w:t>Do not store the optional question in the MVP; do not send it to an external AI service.</w:t>
+        <w:t>Optional free text and voice transcripts remain in the browser and are not sent to the routing or Ollama API. Optional patient details remain in browser state and are included only in the user-selected shared message after a separate acknowledgement.</w:t>
       </w:r>
     </w:p>
     <w:p>
@@ -5888,12 +5696,7 @@
         <w:spacing w:after="100" w:line="264" w:lineRule="auto"/>
       </w:pPr>
       <w:r>
-        <w:rPr>
-          <w:rFonts w:ascii="Calibri" w:hAnsi="Calibri"/>
-          <w:color w:val="0B2545"/>
-          <w:sz w:val="22"/>
-        </w:rPr>
-        <w:t>For the controlled pilot, send only approved guidance copy from the server; never send voice transcripts, symptom details, optional questions, district/location or identifiers to the GenAI provider.</w:t>
+        <w:t>The live Ollama request contains PostgreSQL-retrieved Bengali guidance and the Java-selected route. It does not contain free text, voice transcript, location, patient details or identifiers. Current route-guidance records are explicitly demo-simulated, not clinically approved.</w:t>
       </w:r>
     </w:p>
     <w:p>
@@ -5902,12 +5705,7 @@
         <w:spacing w:after="100" w:line="264" w:lineRule="auto"/>
       </w:pPr>
       <w:r>
-        <w:rPr>
-          <w:rFonts w:ascii="Calibri" w:hAnsi="Calibri"/>
-          <w:color w:val="0B2545"/>
-          <w:sz w:val="22"/>
-        </w:rPr>
-        <w:t>Keep the GenAI provider key in server-side configuration only. Label any accepted simplified copy as AI-assisted and display the original approved message when the service fails or output does not pass validation.</w:t>
+        <w:t>Ollama is configured server-side and is local by default. Java validates every candidate response and returns fixed Bengali fallback copy when Ollama, retrieval or validation fails. The current UI does not explicitly label accepted output as AI-assisted; add that label before a controlled pilot.</w:t>
       </w:r>
     </w:p>
     <w:p>
@@ -5916,12 +5714,7 @@
         <w:spacing w:after="100" w:line="264" w:lineRule="auto"/>
       </w:pPr>
       <w:r>
-        <w:rPr>
-          <w:rFonts w:ascii="Calibri" w:hAnsi="Calibri"/>
-          <w:color w:val="0B2545"/>
-          <w:sz w:val="22"/>
-        </w:rPr>
-        <w:t>The controlled-pilot caregiver summary may use only already-approved result content. It must retain the fixed summary as fallback and must not receive user-entered data or create clinical advice.</w:t>
+        <w:t>The live family-message feature is browser share/copy of the selected route guidance and selected symptoms. A separately generated AI caregiver summary from clinically approved result content is deferred.</w:t>
       </w:r>
     </w:p>
     <w:p>
@@ -5930,12 +5723,7 @@
         <w:spacing w:after="100" w:line="264" w:lineRule="auto"/>
       </w:pPr>
       <w:r>
-        <w:rPr>
-          <w:rFonts w:ascii="Calibri" w:hAnsi="Calibri"/>
-          <w:color w:val="0B2545"/>
-          <w:sz w:val="22"/>
-        </w:rPr>
-        <w:t>Reject GenAI output if it contains a diagnosis or disease name, medicine/dosage, changed urgency or care type, unsupported clinical facts, or new service/provider detail. Reject output that is not concise Bengali plain language; show the approved fixed copy instead.</w:t>
+        <w:t>Java rejects unsafe or route-inconsistent Ollama output, including diagnosis, medicine/dosage, treatment, cure, changed urgency or care type. It shows fixed Bengali fallback copy instead.</w:t>
       </w:r>
     </w:p>
     <w:p>
@@ -5944,12 +5732,7 @@
         <w:spacing w:after="100" w:line="264" w:lineRule="auto"/>
       </w:pPr>
       <w:r>
-        <w:rPr>
-          <w:rFonts w:ascii="Calibri" w:hAnsi="Calibri"/>
-          <w:color w:val="0B2545"/>
-          <w:sz w:val="22"/>
-        </w:rPr>
-        <w:t>Use only partner-verified service data for any pilot or public launch; display source, reviewer and last-reviewed date in the partner system.</w:t>
+        <w:t>The live UI uses static demo service options. A PostgreSQL service-location repository exists but is not integrated into the UI. Partner verification, source, reviewer, last-reviewed date and expiry are required before public use.</w:t>
       </w:r>
     </w:p>
     <w:p>
@@ -5958,12 +5741,7 @@
         <w:spacing w:after="100" w:line="264" w:lineRule="auto"/>
       </w:pPr>
       <w:r>
-        <w:rPr>
-          <w:rFonts w:ascii="Calibri" w:hAnsi="Calibri"/>
-          <w:color w:val="0B2545"/>
-          <w:sz w:val="22"/>
-        </w:rPr>
-        <w:t>Provide a human escalation option for uncertainty, repeated failure, urgent conditions and user request.</w:t>
+        <w:t>Human support is available when the user explicitly requests help, selects Other/unclear concern, criteria escalate, or no eligible demo criterion is available. An urgent outcome always takes precedence.</w:t>
       </w:r>
     </w:p>
     <w:p>
@@ -5972,12 +5750,7 @@
         <w:spacing w:after="100" w:line="264" w:lineRule="auto"/>
       </w:pPr>
       <w:r>
-        <w:rPr>
-          <w:rFonts w:ascii="Calibri" w:hAnsi="Calibri"/>
-          <w:color w:val="0B2545"/>
-          <w:sz w:val="22"/>
-        </w:rPr>
-        <w:t>Obtain informed consent before research recordings; anonymise interview records and secure recordings separately from study notes.</w:t>
+        <w:t>Current demo logging includes route input codes in backend logs. Before a pilot, change this to non-content audit metadata only: selected route, rule version, feature-flag state, validation result and fallback reason. Do not retain health-selection codes, location or identity.</w:t>
       </w:r>
     </w:p>
     <w:p>
@@ -6221,11 +5994,6 @@
               <w:spacing w:after="0"/>
             </w:pPr>
             <w:r>
-              <w:rPr>
-                <w:rFonts w:ascii="Calibri" w:hAnsi="Calibri"/>
-                <w:color w:val="0B2545"/>
-                <w:sz w:val="18"/>
-              </w:rPr>
               <w:t>Pilot operations owner; disables the feature flag, preserves the fixed-copy path and routes safety concerns to the defined escalation process.</w:t>
             </w:r>
           </w:p>
@@ -6262,12 +6030,7 @@
               <w:spacing w:after="0"/>
             </w:pPr>
             <w:r>
-              <w:rPr>
-                <w:rFonts w:ascii="Calibri" w:hAnsi="Calibri"/>
-                <w:color w:val="0B2545"/>
-                <w:sz w:val="18"/>
-              </w:rPr>
-              <w:t>Record only non-content audit metadata: selected outcome, feature-flag state, validation result and fallback reason. Do not log user health content, location or identity.</w:t>
+              <w:t>Live demo status: selected concern/history codes and matched criteria are currently logged. Pilot requirement: replace this with non-content audit metadata only - route, rule version, feature-flag state, validation result and fallback reason - and do not log health selections, location or identity.</w:t>
             </w:r>
           </w:p>
         </w:tc>
@@ -6396,12 +6159,7 @@
               <w:spacing w:after="0"/>
             </w:pPr>
             <w:r>
-              <w:rPr>
-                <w:rFonts w:ascii="Calibri" w:hAnsi="Calibri"/>
-                <w:color w:val="0B2545"/>
-                <w:sz w:val="18"/>
-              </w:rPr>
-              <w:t>Mobile-first layout; Bengali-first labels; touch targets; voice and text alternatives; readable contrast; no mandatory English input.</w:t>
+              <w:t>Mobile-first layout; Bengali-first labels; touch targets; browser speech input and typed alternatives; readable contrast; no mandatory English input.</w:t>
             </w:r>
           </w:p>
         </w:tc>
@@ -6437,12 +6195,7 @@
               <w:spacing w:after="0"/>
             </w:pPr>
             <w:r>
-              <w:rPr>
-                <w:rFonts w:ascii="Calibri" w:hAnsi="Calibri"/>
-                <w:color w:val="0B2545"/>
-                <w:sz w:val="18"/>
-              </w:rPr>
-              <w:t>Show a response or safe connection-error message within 10 seconds on ordinary mobile connectivity; never leave the user without an urgent-care instruction.</w:t>
+              <w:t>The live UI shows the Java-selected route and fixed action card immediately, while the optional Ollama explanation loads asynchronously. The current Ollama read timeout is 75 seconds; a &lt;=10-second AI response/fallback objective remains a pilot release gate.</w:t>
             </w:r>
           </w:p>
         </w:tc>
@@ -6478,11 +6231,6 @@
               <w:spacing w:after="0"/>
             </w:pPr>
             <w:r>
-              <w:rPr>
-                <w:rFonts w:ascii="Calibri" w:hAnsi="Calibri"/>
-                <w:color w:val="0B2545"/>
-                <w:sz w:val="18"/>
-              </w:rPr>
               <w:t>If voice input, sharing or service lookup fails, keep text guidance visible and present a practical fallback.</w:t>
             </w:r>
           </w:p>
@@ -6519,11 +6267,6 @@
               <w:spacing w:after="0"/>
             </w:pPr>
             <w:r>
-              <w:rPr>
-                <w:rFonts w:ascii="Calibri" w:hAnsi="Calibri"/>
-                <w:color w:val="0B2545"/>
-                <w:sz w:val="18"/>
-              </w:rPr>
               <w:t>HTTPS in deployment; API input validation; server-side configuration only; no secret keys in the browser; rate limiting before public pilot.</w:t>
             </w:r>
           </w:p>
@@ -6560,12 +6303,7 @@
               <w:spacing w:after="0"/>
             </w:pPr>
             <w:r>
-              <w:rPr>
-                <w:rFonts w:ascii="Calibri" w:hAnsi="Calibri"/>
-                <w:color w:val="0B2545"/>
-                <w:sz w:val="18"/>
-              </w:rPr>
-              <w:t>Feature flag defaults off; model receives approved copy only; bounded Bengali output is evaluated and validated; original approved copy is the safe fallback for all failures.</w:t>
+              <w:t>Live MVP: feature flags default off; when enabled, local Ollama receives PostgreSQL-retrieved Bengali route guidance after Java selects the route. Java validates bounded output and returns fixed Bengali fallback. Clinical approval of the corpus and explicit AI-assisted labelling are required before a controlled pilot.</w:t>
             </w:r>
           </w:p>
         </w:tc>
@@ -6601,11 +6339,6 @@
               <w:spacing w:after="0"/>
             </w:pPr>
             <w:r>
-              <w:rPr>
-                <w:rFonts w:ascii="Calibri" w:hAnsi="Calibri"/>
-                <w:color w:val="0B2545"/>
-                <w:sz w:val="18"/>
-              </w:rPr>
               <w:t>Rules, Bengali wording and service listings must be versioned and reviewable; safety changes require clinician approval.</w:t>
             </w:r>
           </w:p>
@@ -6637,12 +6370,7 @@
         <w:spacing w:after="100" w:line="264" w:lineRule="auto"/>
       </w:pPr>
       <w:r>
-        <w:rPr>
-          <w:rFonts w:ascii="Calibri" w:hAnsi="Calibri"/>
-          <w:color w:val="0B2545"/>
-          <w:sz w:val="22"/>
-        </w:rPr>
-        <w:t>User opens NetraJyoti and sees the Bengali-first purpose and non-diagnosis boundary.</w:t>
+        <w:t>User opens NetraJyoti and sees the Bengali-first purpose, urgent warning and non-diagnosis boundary.</w:t>
       </w:r>
     </w:p>
     <w:p>
@@ -6651,12 +6379,7 @@
         <w:spacing w:after="100" w:line="264" w:lineRule="auto"/>
       </w:pPr>
       <w:r>
-        <w:rPr>
-          <w:rFonts w:ascii="Calibri" w:hAnsi="Calibri"/>
-          <w:color w:val="0B2545"/>
-          <w:sz w:val="22"/>
-        </w:rPr>
-        <w:t>User acknowledges safety and privacy information.</w:t>
+        <w:t>User acknowledges the safety/privacy statement before the assessment begins.</w:t>
       </w:r>
     </w:p>
     <w:p>
@@ -6665,12 +6388,7 @@
         <w:spacing w:after="100" w:line="264" w:lineRule="auto"/>
       </w:pPr>
       <w:r>
-        <w:rPr>
-          <w:rFonts w:ascii="Calibri" w:hAnsi="Calibri"/>
-          <w:color w:val="0B2545"/>
-          <w:sz w:val="22"/>
-        </w:rPr>
-        <w:t>User chooses a concern, records urgent flags, enters a district and optionally speaks or types a question.</w:t>
+        <w:t>User selects one or more fixed symptoms, checks urgent warning signs, may select optional Step 3A history, and may speak or type optional detail. Voice/free text do not determine the route.</w:t>
       </w:r>
     </w:p>
     <w:p>
@@ -6679,12 +6397,7 @@
         <w:spacing w:after="100" w:line="264" w:lineRule="auto"/>
       </w:pPr>
       <w:r>
-        <w:rPr>
-          <w:rFonts w:ascii="Calibri" w:hAnsi="Calibri"/>
-          <w:color w:val="0B2545"/>
-          <w:sz w:val="22"/>
-        </w:rPr>
-        <w:t>Rules engine classifies the session as URGENT, ROUTINE or HUMAN ESCALATION.</w:t>
+        <w:t>Java retrieves matching PostgreSQL criteria and deterministically selects URGENT, ROUTINE or HUMAN SUPPORT. Urgent has highest precedence. In the current demo, Step 3A history is displayed as context and the simulated seed data contain no history criteria that alter the route.</w:t>
       </w:r>
     </w:p>
     <w:p>
@@ -6693,12 +6406,7 @@
         <w:spacing w:after="100" w:line="264" w:lineRule="auto"/>
       </w:pPr>
       <w:r>
-        <w:rPr>
-          <w:rFonts w:ascii="Calibri" w:hAnsi="Calibri"/>
-          <w:color w:val="0B2545"/>
-          <w:sz w:val="22"/>
-        </w:rPr>
-        <w:t>User receives fixed Bengali text and optional audio. Urgent cases are told not to wait.</w:t>
+        <w:t>The user sees the fixed route action card and selected symptoms. The UI then collects district/town or location only for demo service direction; this does not change the route. Result-page audio is not part of the live MVP.</w:t>
       </w:r>
     </w:p>
     <w:p>
@@ -6707,12 +6415,7 @@
         <w:spacing w:after="100" w:line="264" w:lineRule="auto"/>
       </w:pPr>
       <w:r>
-        <w:rPr>
-          <w:rFonts w:ascii="Calibri" w:hAnsi="Calibri"/>
-          <w:color w:val="0B2545"/>
-          <w:sz w:val="22"/>
-        </w:rPr>
-        <w:t>In the controlled pilot only, the user may request an AI-assisted plain-Bengali explanation of that already-approved message; the fixed message remains visible and is the fallback.</w:t>
+        <w:t>When explicitly enabled, PostgreSQL retrieves Bengali guidance for the Java-selected route and local Ollama generates one concise Bengali explanation. Java validates it; on failure, the fixed Bengali fallback remains visible. The current source records are demo-simulated, not clinically approved.</w:t>
       </w:r>
     </w:p>
     <w:p>
@@ -6721,12 +6424,7 @@
         <w:spacing w:after="100" w:line="264" w:lineRule="auto"/>
       </w:pPr>
       <w:r>
-        <w:rPr>
-          <w:rFonts w:ascii="Calibri" w:hAnsi="Calibri"/>
-          <w:color w:val="0B2545"/>
-          <w:sz w:val="22"/>
-        </w:rPr>
-        <w:t>User sees a demo-only service direction, may share a caregiver summary, and can provide feedback or restart.</w:t>
+        <w:t>User can view static demo service direction, review/copy/share a family message, go back, return to the current route result or restart. Feedback capture is deferred.</w:t>
       </w:r>
     </w:p>
     <w:p>
@@ -7285,14 +6983,8 @@
             <w:pPr>
               <w:spacing w:after="20"/>
             </w:pPr>
-            <w:r/>
-            <w:r>
-              <w:rPr>
-                <w:rFonts w:ascii="Aptos" w:hAnsi="Aptos"/>
-                <w:b w:val="0"/>
-                <w:sz w:val="17"/>
-              </w:rPr>
-              <w:t>Receives immediate-care advice; can find care, share, or continue to care.</w:t>
+            <w:r>
+              <w:t>Receives immediate-care advice; can find demo care options, share, or continue to care.</w:t>
             </w:r>
           </w:p>
         </w:tc>
@@ -7305,14 +6997,8 @@
             <w:pPr>
               <w:spacing w:after="20"/>
             </w:pPr>
-            <w:r/>
-            <w:r>
-              <w:rPr>
-                <w:rFonts w:ascii="Aptos" w:hAnsi="Aptos"/>
-                <w:b w:val="0"/>
-                <w:sz w:val="17"/>
-              </w:rPr>
-              <w:t>Keeps urgent guidance visible and provides a safe return point.</w:t>
+            <w:r>
+              <w:t>Keeps the Java-controlled urgent action visible. Optional Ollama explanation loads asynchronously and cannot change the route.</w:t>
             </w:r>
           </w:p>
         </w:tc>
@@ -7369,14 +7055,8 @@
             <w:pPr>
               <w:spacing w:after="20"/>
             </w:pPr>
-            <w:r/>
-            <w:r>
-              <w:rPr>
-                <w:rFonts w:ascii="Aptos" w:hAnsi="Aptos"/>
-                <w:b w:val="0"/>
-                <w:sz w:val="17"/>
-              </w:rPr>
-              <w:t>Chooses area, reviews recommendation/service direction, and prepares family message.</w:t>
+            <w:r>
+              <w:t>Chooses district/town after the Java route is selected, reviews recommendation/service direction, and prepares a family share message.</w:t>
             </w:r>
           </w:p>
         </w:tc>
@@ -7390,14 +7070,8 @@
             <w:pPr>
               <w:spacing w:after="20"/>
             </w:pPr>
-            <w:r/>
-            <w:r>
-              <w:rPr>
-                <w:rFonts w:ascii="Aptos" w:hAnsi="Aptos"/>
-                <w:b w:val="0"/>
-                <w:sz w:val="17"/>
-              </w:rPr>
-              <w:t>Provides approved routine guidance. Optional AI never changes the route.</w:t>
+            <w:r>
+              <w:t>Shows the Java-controlled routine action card immediately. Optional Ollama explanation loads asynchronously and cannot change the route. Static demo service options are shown on the next screen.</w:t>
             </w:r>
           </w:p>
         </w:tc>
@@ -7733,14 +7407,8 @@
             <w:pPr>
               <w:spacing w:after="20"/>
             </w:pPr>
-            <w:r/>
-            <w:r>
-              <w:rPr>
-                <w:rFonts w:ascii="Aptos" w:hAnsi="Aptos"/>
-                <w:b w:val="0"/>
-                <w:sz w:val="17"/>
-              </w:rPr>
-              <w:t>One or more symptoms selected and submitted</w:t>
+            <w:r>
+              <w:t>One or more symptoms selected and 'Check urgent warning signs' tapped</w:t>
             </w:r>
           </w:p>
         </w:tc>
@@ -7796,14 +7464,8 @@
             <w:pPr>
               <w:spacing w:after="20"/>
             </w:pPr>
-            <w:r/>
-            <w:r>
-              <w:rPr>
-                <w:rFonts w:ascii="Aptos" w:hAnsi="Aptos"/>
-                <w:b w:val="0"/>
-                <w:sz w:val="17"/>
-              </w:rPr>
-              <w:t>Urgent-warning answers submitted / “Check urgent warning signs” tapped</w:t>
+            <w:r>
+              <w:t>Urgent-sign check completed; optional Step 3A history selected or skipped; then 'View safe guidance' tapped</w:t>
             </w:r>
           </w:p>
         </w:tc>
@@ -7860,14 +7522,8 @@
             <w:pPr>
               <w:spacing w:after="20"/>
             </w:pPr>
-            <w:r/>
-            <w:r>
-              <w:rPr>
-                <w:rFonts w:ascii="Aptos" w:hAnsi="Aptos"/>
-                <w:b w:val="0"/>
-                <w:sz w:val="17"/>
-              </w:rPr>
-              <w:t>Reviewed rules detect an urgent warning sign</w:t>
+            <w:r>
+              <w:t>Java/PostgreSQL criteria detect an urgent warning sign</w:t>
             </w:r>
           </w:p>
         </w:tc>
@@ -7923,14 +7579,8 @@
             <w:pPr>
               <w:spacing w:after="20"/>
             </w:pPr>
-            <w:r/>
-            <w:r>
-              <w:rPr>
-                <w:rFonts w:ascii="Aptos" w:hAnsi="Aptos"/>
-                <w:b w:val="0"/>
-                <w:sz w:val="17"/>
-              </w:rPr>
-              <w:t>No urgent sign and routine guidance is approved</w:t>
+            <w:r>
+              <w:t>Java/PostgreSQL criteria select ROUTINE; district/town is collected after the route for service direction only</w:t>
             </w:r>
           </w:p>
         </w:tc>
@@ -8808,12 +8458,7 @@
               <w:spacing w:after="0"/>
             </w:pPr>
             <w:r>
-              <w:rPr>
-                <w:rFonts w:ascii="Calibri" w:hAnsi="Calibri"/>
-                <w:color w:val="0B2545"/>
-                <w:sz w:val="18"/>
-              </w:rPr>
-              <w:t>Users who can successfully use voice or switch to text without abandoning the flow.</w:t>
+              <w:t>Users who can successfully use browser speech recognition or switch to typed input without abandoning the flow.</w:t>
             </w:r>
           </w:p>
         </w:tc>
@@ -8926,11 +8571,6 @@
               <w:spacing w:after="0"/>
             </w:pPr>
             <w:r>
-              <w:rPr>
-                <w:rFonts w:ascii="Calibri" w:hAnsi="Calibri"/>
-                <w:color w:val="0B2545"/>
-                <w:sz w:val="18"/>
-              </w:rPr>
               <w:t>Users reporting that guidance was clear; unresolved/unsafe sessions flagged for review.</w:t>
             </w:r>
           </w:p>
@@ -8985,12 +8625,7 @@
               <w:spacing w:after="0"/>
             </w:pPr>
             <w:r>
-              <w:rPr>
-                <w:rFonts w:ascii="Calibri" w:hAnsi="Calibri"/>
-                <w:color w:val="0B2545"/>
-                <w:sz w:val="18"/>
-              </w:rPr>
-              <w:t>Caregiver can repeat the approved next step after reading or hearing the AI-assisted summary.</w:t>
+              <w:t>Deferred controlled-pilot measure. The live MVP has a share/copy family message, not a separate AI caregiver summary.</w:t>
             </w:r>
           </w:p>
         </w:tc>
@@ -9044,12 +8679,7 @@
               <w:spacing w:after="0"/>
             </w:pPr>
             <w:r>
-              <w:rPr>
-                <w:rFonts w:ascii="Calibri" w:hAnsi="Calibri"/>
-                <w:color w:val="0B2545"/>
-                <w:sz w:val="18"/>
-              </w:rPr>
-              <w:t>Sampled GenAI summaries preserve the selected urgency, care type and next-step instruction.</w:t>
+              <w:t>Sampled validated Ollama explanations preserve the Java-selected route, urgency and next-step boundary.</w:t>
             </w:r>
           </w:p>
         </w:tc>
@@ -9103,12 +8733,7 @@
               <w:spacing w:after="0"/>
             </w:pPr>
             <w:r>
-              <w:rPr>
-                <w:rFonts w:ascii="Calibri" w:hAnsi="Calibri"/>
-                <w:color w:val="0B2545"/>
-                <w:sz w:val="18"/>
-              </w:rPr>
-              <w:t>Rate of rejected/failed GenAI requests that display the approved fixed copy; verify no user-entered data reaches the provider.</w:t>
+              <w:t>Rate of failed/rejected Ollama requests that display fixed Bengali fallback; verify that free text, voice, location and patient details never reach Ollama.</w:t>
             </w:r>
           </w:p>
         </w:tc>
@@ -9298,12 +8923,6 @@
               <w:spacing w:after="0"/>
             </w:pPr>
             <w:r>
-              <w:rPr>
-                <w:rFonts w:ascii="Calibri" w:hAnsi="Calibri"/>
-                <w:b/>
-                <w:color w:val="1F4D78"/>
-                <w:sz w:val="19"/>
-              </w:rPr>
               <w:t>Dependency / risk</w:t>
             </w:r>
           </w:p>
@@ -9325,12 +8944,6 @@
               <w:spacing w:after="0"/>
             </w:pPr>
             <w:r>
-              <w:rPr>
-                <w:rFonts w:ascii="Calibri" w:hAnsi="Calibri"/>
-                <w:b/>
-                <w:color w:val="1F4D78"/>
-                <w:sz w:val="19"/>
-              </w:rPr>
               <w:t>Mitigation or decision</w:t>
             </w:r>
           </w:p>
@@ -9367,12 +8980,7 @@
               <w:spacing w:after="0"/>
             </w:pPr>
             <w:r>
-              <w:rPr>
-                <w:rFonts w:ascii="Calibri" w:hAnsi="Calibri"/>
-                <w:color w:val="0B2545"/>
-                <w:sz w:val="18"/>
-              </w:rPr>
-              <w:t>Do not launch publicly; obtain documented review and periodic ownership before pilot.</w:t>
+              <w:t>Do not launch publicly. The current PostgreSQL pathways and Bengali guidance are marked DEMO_SIMULATED_NOT_FOR_CLINICAL_USE; obtain documented clinical review, approval, versioning and ownership before a pilot.</w:t>
             </w:r>
           </w:p>
         </w:tc>
@@ -9408,11 +9016,6 @@
               <w:spacing w:after="0"/>
             </w:pPr>
             <w:r>
-              <w:rPr>
-                <w:rFonts w:ascii="Calibri" w:hAnsi="Calibri"/>
-                <w:color w:val="0B2545"/>
-                <w:sz w:val="18"/>
-              </w:rPr>
               <w:t>Keep demo-only warning now; add authenticated, partner-owned update and expiry workflow later.</w:t>
             </w:r>
           </w:p>
@@ -9449,11 +9052,6 @@
               <w:spacing w:after="0"/>
             </w:pPr>
             <w:r>
-              <w:rPr>
-                <w:rFonts w:ascii="Calibri" w:hAnsi="Calibri"/>
-                <w:color w:val="0B2545"/>
-                <w:sz w:val="18"/>
-              </w:rPr>
               <w:t>Use browser speech only as an assistive input; provide text fallback and test with target users.</w:t>
             </w:r>
           </w:p>
@@ -9490,11 +9088,6 @@
               <w:spacing w:after="0"/>
             </w:pPr>
             <w:r>
-              <w:rPr>
-                <w:rFonts w:ascii="Calibri" w:hAnsi="Calibri"/>
-                <w:color w:val="0B2545"/>
-                <w:sz w:val="18"/>
-              </w:rPr>
               <w:t>Conduct five real, consented JTBD interviews; retain raw notes, exact quotes and recording references; do not fabricate findings.</w:t>
             </w:r>
           </w:p>
@@ -9531,12 +9124,7 @@
               <w:spacing w:after="0"/>
             </w:pPr>
             <w:r>
-              <w:rPr>
-                <w:rFonts w:ascii="Calibri" w:hAnsi="Calibri"/>
-                <w:color w:val="0B2545"/>
-                <w:sz w:val="18"/>
-              </w:rPr>
-              <w:t>Repeat boundary language at consent, result and share points; avoid disease names and treatment recommendations.</w:t>
+              <w:t>Repeat boundary language at consent, result and share points; avoid disease names and treatment recommendations. The live UI meets this boundary, but usability validation remains required.</w:t>
             </w:r>
           </w:p>
         </w:tc>
@@ -9572,12 +9160,7 @@
               <w:spacing w:after="0"/>
             </w:pPr>
             <w:r>
-              <w:rPr>
-                <w:rFonts w:ascii="Calibri" w:hAnsi="Calibri"/>
-                <w:color w:val="0B2545"/>
-                <w:sz w:val="18"/>
-              </w:rPr>
-              <w:t>Keep it feature-flagged and pilot-only; provide only approved source copy; validate bounded output; label it AI-assisted; preserve the original approved copy and fall back to it on any failure.</w:t>
+              <w:t>The live local Ollama path is post-route and Java-validated. Before a pilot, use clinically approved source content, add explicit AI-assisted labelling, bound response time and retain non-content evaluation evidence.</w:t>
             </w:r>
           </w:p>
         </w:tc>
@@ -9595,12 +9178,7 @@
               <w:spacing w:after="0"/>
             </w:pPr>
             <w:r>
-              <w:rPr>
-                <w:rFonts w:ascii="Calibri" w:hAnsi="Calibri"/>
-                <w:color w:val="0B2545"/>
-                <w:sz w:val="18"/>
-              </w:rPr>
-              <w:t>A GenAI provider credential could be exposed or unavailable.</w:t>
+              <w:t>A local Ollama service may be unavailable or inadvertently exposed.</w:t>
             </w:r>
           </w:p>
         </w:tc>
@@ -9613,12 +9191,51 @@
               <w:spacing w:after="0"/>
             </w:pPr>
             <w:r>
-              <w:rPr>
-                <w:rFonts w:ascii="Calibri" w:hAnsi="Calibri"/>
-                <w:color w:val="0B2545"/>
-                <w:sz w:val="18"/>
-              </w:rPr>
-              <w:t>Configure the provider key only in the backend environment; never in React/browser code; disable the feature when configuration is absent and retain fixed-copy guidance.</w:t>
+              <w:t>Keep local Ollama behind the backend and do not expose it to the browser or public internet; retain Java fallback when unavailable.</w:t>
+            </w:r>
+          </w:p>
+        </w:tc>
+      </w:tr>
+      <w:tr>
+        <w:tc>
+          <w:tcPr>
+            <w:tcW w:type="dxa" w:w="3300"/>
+          </w:tcPr>
+          <w:p>
+            <w:r>
+              <w:t>Current demo logs selected health codes and matched criteria.</w:t>
+            </w:r>
+          </w:p>
+        </w:tc>
+        <w:tc>
+          <w:tcPr>
+            <w:tcW w:type="dxa" w:w="6060"/>
+          </w:tcPr>
+          <w:p>
+            <w:r>
+              <w:t>Before pilot, redact/stop content logging and retain only non-content audit metadata. Validate this with automated log tests.</w:t>
+            </w:r>
+          </w:p>
+        </w:tc>
+      </w:tr>
+      <w:tr>
+        <w:tc>
+          <w:tcPr>
+            <w:tcW w:type="dxa" w:w="3300"/>
+          </w:tcPr>
+          <w:p>
+            <w:r>
+              <w:t>Step 3A history is accepted by the repository routing-query contract even though the current demo UI describes it as context only.</w:t>
+            </w:r>
+          </w:p>
+        </w:tc>
+        <w:tc>
+          <w:tcPr>
+            <w:tcW w:type="dxa" w:w="6060"/>
+          </w:tcPr>
+          <w:p>
+            <w:r>
+              <w:t>Keep simulated and future approved history criteria out of route selection unless a revised PRD, clinical review and explicit user-facing explanation authorise that change.</w:t>
             </w:r>
           </w:p>
         </w:tc>
@@ -10195,12 +9812,7 @@
         <w:spacing w:before="0" w:after="120" w:line="264" w:lineRule="auto"/>
       </w:pPr>
       <w:r>
-        <w:rPr>
-          <w:rFonts w:ascii="Calibri" w:hAnsi="Calibri"/>
-          <w:color w:val="0B2545"/>
-          <w:sz w:val="22"/>
-        </w:rPr>
-        <w:t>This PRD synthesises the project summary and evidence appendix in NETRAJYOTI.docx and the Phase 2 strategy, interview plan, safety matrix, MVP plan and user stories in NetraJyoti_Capstone_Project_Submission_Pack_v2.docx. Evidence references E1–E12 and comparator materials remain in the source documents. This PRD does not claim that the required five real interviews or clinical validation have already been completed.</w:t>
+        <w:t>This PRD synthesises the project summary and evidence appendix in NETRAJYOTI.docx and the Phase 2 strategy, interview plan, safety matrix, MVP plan and user stories in NetraJyoti_Capstone_Project_Submission_Pack_v2.docx. Version 5.2 also records an implementation review of the current React/Vite UI, Java/Spring Boot API, PostgreSQL seed data and local Ollama integration as of 3 September 2026. Evidence references E1-E12 and comparator materials remain in the source documents. This PRD does not claim that the required five real interviews or clinical validation have already been completed.</w:t>
       </w:r>
     </w:p>
     <w:sectPr>

</xml_diff>